<commit_message>
feat(cand, casd, cacd, caed): "Page" over the contents' page column (fb-595.96)
The four California district motion briefs set the model's new contents.page_heading, "Page" at the right under the
table of contents' title, as their exemplars do (and the old N.D. and E.D. Cal. templates did); the open tier-2
finding of each review is closed. Re-rendered in all three engines, page counts unchanged (11, 9, 10, 9);
check.sh 0 failed on typst, latex and docx for each, XENG-001..003 PASS, DEF-TOC-001 PASS.

Co-Authored-By: Claude Opus 5.5 <noreply@anthropic.com>
Gate: fb-595-96-a1 79076997ff15cd4647bf4d1a6f4528990c29bb78
</commit_message>
<xml_diff>
--- a/courts/ninth-circuit/california/federal/central-district/motion-brief/usage/OUTPUT-motion-brief.docx
+++ b/courts/ninth-circuit/california/federal/central-district/motion-brief/usage/OUTPUT-motion-brief.docx
@@ -2566,6 +2566,22 @@
           <w:bCs/>
         </w:rPr>
         <w:t xml:space="preserve">CONTENTS</w:t>
+      </w:r>
+    </w:p>
+    <w:p>
+      <w:pPr>
+        <w:keepNext/>
+        <w:keepLines/>
+        <w:spacing w:before="0" w:after="0" w:line="480" w:lineRule="exact"/>
+        <w:ind w:left="0" w:firstLine="0"/>
+        <w:jc w:val="right"/>
+      </w:pPr>
+      <w:r>
+        <w:rPr>
+          <w:b/>
+          <w:bCs/>
+        </w:rPr>
+        <w:t xml:space="preserve">Page</w:t>
       </w:r>
     </w:p>
     <w:p>

</xml_diff>